<commit_message>
feat: change docs (rulebook, template) for cpc and kti
</commit_message>
<xml_diff>
--- a/public/assets/template/kti.docx
+++ b/public/assets/template/kti.docx
@@ -1,6 +1,6 @@
 
 <file path=word/document.xml><?xml version="1.0" encoding="utf-8"?>
-<w:document xmlns:mc="http://schemas.openxmlformats.org/markup-compatibility/2006" xmlns:o="urn:schemas-microsoft-com:office:office" xmlns:r="http://schemas.openxmlformats.org/officeDocument/2006/relationships" xmlns:m="http://schemas.openxmlformats.org/officeDocument/2006/math" xmlns:v="urn:schemas-microsoft-com:vml" xmlns:wp="http://schemas.openxmlformats.org/drawingml/2006/wordprocessingDrawing" xmlns:w10="urn:schemas-microsoft-com:office:word" xmlns:w="http://schemas.openxmlformats.org/wordprocessingml/2006/main" xmlns:wne="http://schemas.microsoft.com/office/word/2006/wordml" xmlns:sl="http://schemas.openxmlformats.org/schemaLibrary/2006/main" xmlns:a="http://schemas.openxmlformats.org/drawingml/2006/main" xmlns:pic="http://schemas.openxmlformats.org/drawingml/2006/picture" xmlns:c="http://schemas.openxmlformats.org/drawingml/2006/chart" xmlns:lc="http://schemas.openxmlformats.org/drawingml/2006/lockedCanvas" xmlns:dgm="http://schemas.openxmlformats.org/drawingml/2006/diagram" xmlns:wps="http://schemas.microsoft.com/office/word/2010/wordprocessingShape" xmlns:wpg="http://schemas.microsoft.com/office/word/2010/wordprocessingGroup" xmlns:w14="http://schemas.microsoft.com/office/word/2010/wordml" xmlns:w15="http://schemas.microsoft.com/office/word/2012/wordml">
+<w:document xmlns:mc="http://schemas.openxmlformats.org/markup-compatibility/2006" xmlns:o="urn:schemas-microsoft-com:office:office" xmlns:r="http://schemas.openxmlformats.org/officeDocument/2006/relationships" xmlns:m="http://schemas.openxmlformats.org/officeDocument/2006/math" xmlns:v="urn:schemas-microsoft-com:vml" xmlns:wp="http://schemas.openxmlformats.org/drawingml/2006/wordprocessingDrawing" xmlns:w10="urn:schemas-microsoft-com:office:word" xmlns:w="http://schemas.openxmlformats.org/wordprocessingml/2006/main" xmlns:wne="http://schemas.microsoft.com/office/word/2006/wordml" xmlns:sl="http://schemas.openxmlformats.org/schemaLibrary/2006/main" xmlns:a="http://schemas.openxmlformats.org/drawingml/2006/main" xmlns:pic="http://schemas.openxmlformats.org/drawingml/2006/picture" xmlns:c="http://schemas.openxmlformats.org/drawingml/2006/chart" xmlns:lc="http://schemas.openxmlformats.org/drawingml/2006/lockedCanvas" xmlns:dgm="http://schemas.openxmlformats.org/drawingml/2006/diagram" xmlns:wps="http://schemas.microsoft.com/office/word/2010/wordprocessingShape" xmlns:wpg="http://schemas.microsoft.com/office/word/2010/wordprocessingGroup" xmlns:w14="http://schemas.microsoft.com/office/word/2010/wordml" xmlns:w15="http://schemas.microsoft.com/office/word/2012/wordml" xmlns:w16="http://schemas.microsoft.com/office/word/2018/wordml" xmlns:w16cex="http://schemas.microsoft.com/office/word/2018/wordml/cex" xmlns:w16cid="http://schemas.microsoft.com/office/word/2016/wordml/cid" xmlns="http://schemas.microsoft.com/office/tasks/2019/documenttasks" xmlns:cr="http://schemas.microsoft.com/office/comments/2020/reactions">
   <w:body>
     <w:p>
       <w:pPr>
@@ -20,16 +20,16 @@
             <wp:extent cx="1080135" cy="1065530"/>
             <wp:effectExtent b="0" l="0" r="0" t="0"/>
             <wp:wrapNone/>
-            <wp:docPr id="22" name="image3.png"/>
+            <wp:docPr id="34" name="image1.png"/>
             <a:graphic>
               <a:graphicData uri="http://schemas.openxmlformats.org/drawingml/2006/picture">
                 <pic:pic>
                   <pic:nvPicPr>
-                    <pic:cNvPr id="0" name="image3.png"/>
+                    <pic:cNvPr id="0" name="image1.png"/>
                     <pic:cNvPicPr preferRelativeResize="0"/>
                   </pic:nvPicPr>
                   <pic:blipFill>
-                    <a:blip r:embed="rId9"/>
+                    <a:blip r:embed="rId7"/>
                     <a:srcRect b="0" l="0" r="0" t="0"/>
                     <a:stretch>
                       <a:fillRect/>
@@ -158,31 +158,24 @@
     </w:p>
     <w:p>
       <w:pPr>
-        <w:spacing w:after="0" w:line="276" w:lineRule="auto"/>
+        <w:spacing w:after="0" w:lineRule="auto"/>
         <w:ind w:firstLine="720"/>
         <w:jc w:val="center"/>
+        <w:rPr/>
+      </w:pPr>
+      <w:r>
+        <w:rPr>
+          <w:rtl w:val="0"/>
+        </w:rPr>
+        <w:t xml:space="preserve">"Optimalisasi Peran Generasi Muda Berbasis Inovasi Agroindustri dan Teknologi Digital Menuju Indonesia Emas 2045"</w:t>
+      </w:r>
+    </w:p>
+    <w:p>
+      <w:pPr>
+        <w:jc w:val="center"/>
         <w:rPr>
           <w:i w:val="1"/>
-        </w:rPr>
-      </w:pPr>
-      <w:r>
-        <w:rPr>
-          <w:i w:val="1"/>
-          <w:rtl w:val="0"/>
-        </w:rPr>
-        <w:t xml:space="preserve">Innovate to Elevate: Smart Solutions for Bright Futures</w:t>
-      </w:r>
-      <w:r>
-        <w:rPr>
-          <w:rtl w:val="0"/>
-        </w:rPr>
-      </w:r>
-    </w:p>
-    <w:p>
-      <w:pPr>
-        <w:jc w:val="center"/>
-        <w:rPr>
-          <w:i w:val="1"/>
+          <w:iCs w:val="1"/>
         </w:rPr>
       </w:pPr>
       <w:r>
@@ -212,7 +205,7 @@
         <w:rPr>
           <w:rtl w:val="0"/>
         </w:rPr>
-        <w:t xml:space="preserve">KARYA TULIS ILMIAH YANG DIAJUKAN UNTUK ISIC 2024</w:t>
+        <w:t xml:space="preserve">KARYA TULIS ILMIAH YANG DIAJUKAN UNTUK ICOM 2026</w:t>
       </w:r>
     </w:p>
     <w:p>
@@ -257,6 +250,7 @@
       <w:r>
         <w:rPr>
           <w:b w:val="1"/>
+          <w:bCs w:val="1"/>
           <w:color w:val="ff0000"/>
           <w:rtl w:val="0"/>
         </w:rPr>
@@ -289,6 +283,7 @@
       <w:r>
         <w:rPr>
           <w:b w:val="1"/>
+          <w:bCs w:val="1"/>
           <w:color w:val="ff0000"/>
           <w:rtl w:val="0"/>
         </w:rPr>
@@ -321,6 +316,7 @@
       <w:r>
         <w:rPr>
           <w:b w:val="1"/>
+          <w:bCs w:val="1"/>
           <w:color w:val="ff0000"/>
           <w:rtl w:val="0"/>
         </w:rPr>
@@ -387,18 +383,7 @@
         <w:rPr>
           <w:rtl w:val="0"/>
         </w:rPr>
-        <w:t xml:space="preserve">2024</w:t>
-      </w:r>
-    </w:p>
-    <w:p>
-      <w:pPr>
-        <w:jc w:val="center"/>
-        <w:rPr/>
-      </w:pPr>
-      <w:r>
-        <w:rPr>
-          <w:rtl w:val="0"/>
-        </w:rPr>
+        <w:t xml:space="preserve">2026</w:t>
       </w:r>
     </w:p>
     <w:p>
@@ -406,11 +391,13 @@
         <w:pStyle w:val="Title"/>
         <w:rPr>
           <w:b w:val="1"/>
+          <w:bCs w:val="1"/>
         </w:rPr>
       </w:pPr>
       <w:r>
         <w:rPr>
           <w:b w:val="1"/>
+          <w:bCs w:val="1"/>
           <w:rtl w:val="0"/>
         </w:rPr>
         <w:t xml:space="preserve">LEMBAR PENGESAHAN</w:t>
@@ -1417,29 +1404,11 @@
         <w:jc w:val="right"/>
         <w:rPr/>
       </w:pPr>
-      <w:sdt>
-        <w:sdtPr>
-          <w:tag w:val="goog_rdk_0"/>
-        </w:sdtPr>
-        <w:sdtContent>
-          <w:commentRangeStart w:id="0"/>
-        </w:sdtContent>
-      </w:sdt>
-      <w:r>
-        <w:rPr>
-          <w:rtl w:val="0"/>
-        </w:rPr>
-        <w:t xml:space="preserve">Jember … April  202</w:t>
-      </w:r>
-      <w:commentRangeEnd w:id="0"/>
-      <w:r>
-        <w:commentReference w:id="0"/>
-      </w:r>
-      <w:r>
-        <w:rPr>
-          <w:rtl w:val="0"/>
-        </w:rPr>
-        <w:t xml:space="preserve">4</w:t>
+      <w:r>
+        <w:rPr>
+          <w:rtl w:val="0"/>
+        </w:rPr>
+        <w:t xml:space="preserve">Jember … Oktober 2026</w:t>
       </w:r>
     </w:p>
     <w:tbl>
@@ -1864,6 +1833,7 @@
       <w:pPr>
         <w:rPr>
           <w:b w:val="1"/>
+          <w:bCs w:val="1"/>
         </w:rPr>
       </w:pPr>
       <w:r>
@@ -1876,6 +1846,7 @@
       <w:pPr>
         <w:rPr>
           <w:b w:val="1"/>
+          <w:bCs w:val="1"/>
         </w:rPr>
       </w:pPr>
       <w:r>
@@ -1901,11 +1872,13 @@
         <w:pStyle w:val="Title"/>
         <w:rPr>
           <w:b w:val="1"/>
+          <w:bCs w:val="1"/>
         </w:rPr>
       </w:pPr>
       <w:r>
         <w:rPr>
           <w:b w:val="1"/>
+          <w:bCs w:val="1"/>
           <w:rtl w:val="0"/>
         </w:rPr>
         <w:t xml:space="preserve">ABSTRAK</w:t>
@@ -1916,12 +1889,14 @@
         <w:ind w:firstLine="720"/>
         <w:rPr>
           <w:i w:val="1"/>
+          <w:iCs w:val="1"/>
           <w:color w:val="ff0000"/>
         </w:rPr>
       </w:pPr>
       <w:r>
         <w:rPr>
           <w:i w:val="1"/>
+          <w:iCs w:val="1"/>
           <w:color w:val="ff0000"/>
           <w:rtl w:val="0"/>
         </w:rPr>
@@ -1932,12 +1907,14 @@
       <w:pPr>
         <w:rPr>
           <w:b w:val="1"/>
+          <w:bCs w:val="1"/>
           <w:color w:val="ff0000"/>
         </w:rPr>
       </w:pPr>
       <w:r>
         <w:rPr>
           <w:b w:val="1"/>
+          <w:bCs w:val="1"/>
           <w:color w:val="ff0000"/>
           <w:rtl w:val="0"/>
         </w:rPr>
@@ -1971,26 +1948,15 @@
         <w:jc w:val="center"/>
         <w:rPr>
           <w:b w:val="1"/>
-        </w:rPr>
-      </w:pPr>
-      <w:sdt>
-        <w:sdtPr>
-          <w:tag w:val="goog_rdk_1"/>
-        </w:sdtPr>
-        <w:sdtContent>
-          <w:commentRangeStart w:id="1"/>
-        </w:sdtContent>
-      </w:sdt>
+          <w:bCs w:val="1"/>
+        </w:rPr>
+      </w:pPr>
       <w:r>
         <w:rPr>
           <w:rtl w:val="0"/>
         </w:rPr>
         <w:t xml:space="preserve">PENDAHULUAN</w:t>
       </w:r>
-      <w:commentRangeEnd w:id="1"/>
-      <w:r>
-        <w:commentReference w:id="1"/>
-      </w:r>
       <w:r>
         <w:rPr>
           <w:rtl w:val="0"/>
@@ -2009,7 +1975,19 @@
           <w:color w:val="ff0000"/>
           <w:rtl w:val="0"/>
         </w:rPr>
-        <w:t xml:space="preserve">Pendahuluan merupakan gambaran umum dari observasi awal dan fenomena mengenai topik yang diangkat. Latar belakang, rumusan, tujuan dari kegiatan (penelitian, pengabdian, atau yang lainnya) serta manfaat untuk waktu  yang akan datang ditunjukkan dalam pendahuluan. Dengan merujuk dari berbagai sumber pustaka, pandangan singkat dari para penulis/peneliti lain yang pernah melakukan pembahasan topik terkait dapat dikemukakan disini untuk menerangkan kemutakhiran substansi pekerjaan.</w:t>
+        <w:t xml:space="preserve">Pendahuluan merupakan gambaran umum dari observasi awal dan fenomena mengenai topik yang diangkat. Latar belakang, rumusan, serta manfaat untuk waktu  yang akan datang ditunjukkan dalam pendahuluan. Dengan merujuk dari berbagai sumber pustaka, pandangan singkat dari para penulis/peneliti lain yang pernah melakukan pembahasan topik terkait dapat dikemukakan disini untuk menerangkan kemutakhiran substansi pekerjaan.</w:t>
+      </w:r>
+    </w:p>
+    <w:p>
+      <w:pPr>
+        <w:rPr>
+          <w:color w:val="ff0000"/>
+        </w:rPr>
+      </w:pPr>
+      <w:r>
+        <w:rPr>
+          <w:rtl w:val="0"/>
+        </w:rPr>
       </w:r>
     </w:p>
     <w:p>
@@ -2221,6 +2199,312 @@
         <w:jc w:val="center"/>
         <w:rPr>
           <w:b w:val="1"/>
+          <w:bCs w:val="1"/>
+        </w:rPr>
+      </w:pPr>
+      <w:r>
+        <w:rPr>
+          <w:b w:val="1"/>
+          <w:bCs w:val="1"/>
+          <w:rtl w:val="0"/>
+        </w:rPr>
+        <w:t xml:space="preserve">MASALAH PENELITIAN</w:t>
+      </w:r>
+    </w:p>
+    <w:p>
+      <w:pPr>
+        <w:jc w:val="center"/>
+        <w:rPr>
+          <w:color w:val="ff0000"/>
+        </w:rPr>
+      </w:pPr>
+      <w:r>
+        <w:rPr>
+          <w:color w:val="ff0000"/>
+          <w:rtl w:val="0"/>
+        </w:rPr>
+        <w:t xml:space="preserve">Bagian ini berisi masalah dari topik yang diangkat</w:t>
+      </w:r>
+    </w:p>
+    <w:p>
+      <w:pPr>
+        <w:jc w:val="center"/>
+        <w:rPr>
+          <w:color w:val="ff0000"/>
+        </w:rPr>
+      </w:pPr>
+      <w:r>
+        <w:rPr>
+          <w:rtl w:val="0"/>
+        </w:rPr>
+      </w:r>
+    </w:p>
+    <w:p>
+      <w:pPr>
+        <w:jc w:val="center"/>
+        <w:rPr>
+          <w:color w:val="ff0000"/>
+        </w:rPr>
+      </w:pPr>
+      <w:r>
+        <w:rPr>
+          <w:rtl w:val="0"/>
+        </w:rPr>
+      </w:r>
+    </w:p>
+    <w:p>
+      <w:pPr>
+        <w:jc w:val="center"/>
+        <w:rPr>
+          <w:color w:val="ff0000"/>
+        </w:rPr>
+      </w:pPr>
+      <w:r>
+        <w:rPr>
+          <w:rtl w:val="0"/>
+        </w:rPr>
+      </w:r>
+    </w:p>
+    <w:p>
+      <w:pPr>
+        <w:jc w:val="center"/>
+        <w:rPr>
+          <w:color w:val="ff0000"/>
+        </w:rPr>
+      </w:pPr>
+      <w:r>
+        <w:rPr>
+          <w:rtl w:val="0"/>
+        </w:rPr>
+      </w:r>
+    </w:p>
+    <w:p>
+      <w:pPr>
+        <w:jc w:val="center"/>
+        <w:rPr>
+          <w:color w:val="ff0000"/>
+        </w:rPr>
+      </w:pPr>
+      <w:r>
+        <w:rPr>
+          <w:rtl w:val="0"/>
+        </w:rPr>
+      </w:r>
+    </w:p>
+    <w:p>
+      <w:pPr>
+        <w:jc w:val="center"/>
+        <w:rPr>
+          <w:color w:val="ff0000"/>
+        </w:rPr>
+      </w:pPr>
+      <w:r>
+        <w:rPr>
+          <w:rtl w:val="0"/>
+        </w:rPr>
+      </w:r>
+    </w:p>
+    <w:p>
+      <w:pPr>
+        <w:jc w:val="center"/>
+        <w:rPr>
+          <w:color w:val="ff0000"/>
+        </w:rPr>
+      </w:pPr>
+      <w:r>
+        <w:rPr>
+          <w:rtl w:val="0"/>
+        </w:rPr>
+      </w:r>
+    </w:p>
+    <w:p>
+      <w:pPr>
+        <w:jc w:val="center"/>
+        <w:rPr>
+          <w:color w:val="ff0000"/>
+        </w:rPr>
+      </w:pPr>
+      <w:r>
+        <w:rPr>
+          <w:rtl w:val="0"/>
+        </w:rPr>
+      </w:r>
+    </w:p>
+    <w:p>
+      <w:pPr>
+        <w:jc w:val="center"/>
+        <w:rPr>
+          <w:color w:val="ff0000"/>
+        </w:rPr>
+      </w:pPr>
+      <w:r>
+        <w:rPr>
+          <w:rtl w:val="0"/>
+        </w:rPr>
+      </w:r>
+    </w:p>
+    <w:p>
+      <w:pPr>
+        <w:jc w:val="center"/>
+        <w:rPr>
+          <w:color w:val="ff0000"/>
+        </w:rPr>
+      </w:pPr>
+      <w:r>
+        <w:rPr>
+          <w:rtl w:val="0"/>
+        </w:rPr>
+      </w:r>
+    </w:p>
+    <w:p>
+      <w:pPr>
+        <w:jc w:val="center"/>
+        <w:rPr>
+          <w:color w:val="ff0000"/>
+        </w:rPr>
+      </w:pPr>
+      <w:r>
+        <w:rPr>
+          <w:rtl w:val="0"/>
+        </w:rPr>
+      </w:r>
+    </w:p>
+    <w:p>
+      <w:pPr>
+        <w:jc w:val="center"/>
+        <w:rPr>
+          <w:color w:val="ff0000"/>
+        </w:rPr>
+      </w:pPr>
+      <w:r>
+        <w:rPr>
+          <w:rtl w:val="0"/>
+        </w:rPr>
+      </w:r>
+    </w:p>
+    <w:p>
+      <w:pPr>
+        <w:jc w:val="center"/>
+        <w:rPr>
+          <w:color w:val="ff0000"/>
+        </w:rPr>
+      </w:pPr>
+      <w:r>
+        <w:rPr>
+          <w:rtl w:val="0"/>
+        </w:rPr>
+      </w:r>
+    </w:p>
+    <w:p>
+      <w:pPr>
+        <w:jc w:val="center"/>
+        <w:rPr>
+          <w:color w:val="ff0000"/>
+        </w:rPr>
+      </w:pPr>
+      <w:r>
+        <w:rPr>
+          <w:rtl w:val="0"/>
+        </w:rPr>
+      </w:r>
+    </w:p>
+    <w:p>
+      <w:pPr>
+        <w:jc w:val="center"/>
+        <w:rPr>
+          <w:color w:val="ff0000"/>
+        </w:rPr>
+      </w:pPr>
+      <w:r>
+        <w:rPr>
+          <w:rtl w:val="0"/>
+        </w:rPr>
+      </w:r>
+    </w:p>
+    <w:p>
+      <w:pPr>
+        <w:jc w:val="center"/>
+        <w:rPr>
+          <w:color w:val="ff0000"/>
+        </w:rPr>
+      </w:pPr>
+      <w:r>
+        <w:rPr>
+          <w:rtl w:val="0"/>
+        </w:rPr>
+      </w:r>
+    </w:p>
+    <w:p>
+      <w:pPr>
+        <w:jc w:val="center"/>
+        <w:rPr>
+          <w:color w:val="ff0000"/>
+        </w:rPr>
+      </w:pPr>
+      <w:r>
+        <w:rPr>
+          <w:rtl w:val="0"/>
+        </w:rPr>
+      </w:r>
+    </w:p>
+    <w:p>
+      <w:pPr>
+        <w:jc w:val="center"/>
+        <w:rPr>
+          <w:color w:val="ff0000"/>
+        </w:rPr>
+      </w:pPr>
+      <w:r>
+        <w:rPr>
+          <w:rtl w:val="0"/>
+        </w:rPr>
+      </w:r>
+    </w:p>
+    <w:p>
+      <w:pPr>
+        <w:jc w:val="center"/>
+        <w:rPr>
+          <w:color w:val="ff0000"/>
+        </w:rPr>
+      </w:pPr>
+      <w:r>
+        <w:rPr>
+          <w:rtl w:val="0"/>
+        </w:rPr>
+      </w:r>
+    </w:p>
+    <w:p>
+      <w:pPr>
+        <w:jc w:val="center"/>
+        <w:rPr>
+          <w:color w:val="ff0000"/>
+        </w:rPr>
+      </w:pPr>
+      <w:r>
+        <w:rPr>
+          <w:rtl w:val="0"/>
+        </w:rPr>
+      </w:r>
+    </w:p>
+    <w:p>
+      <w:pPr>
+        <w:jc w:val="center"/>
+        <w:rPr>
+          <w:color w:val="ff0000"/>
+        </w:rPr>
+      </w:pPr>
+      <w:r>
+        <w:rPr>
+          <w:rtl w:val="0"/>
+        </w:rPr>
+      </w:r>
+    </w:p>
+    <w:p>
+      <w:pPr>
+        <w:jc w:val="center"/>
+        <w:rPr>
+          <w:b w:val="1"/>
+          <w:bCs w:val="1"/>
           <w:sz w:val="28"/>
           <w:szCs w:val="28"/>
         </w:rPr>
@@ -2228,6 +2512,7 @@
       <w:r>
         <w:rPr>
           <w:b w:val="1"/>
+          <w:bCs w:val="1"/>
           <w:sz w:val="28"/>
           <w:szCs w:val="28"/>
           <w:rtl w:val="0"/>
@@ -2447,47 +2732,10 @@
         <w:rPr>
           <w:color w:val="ff0000"/>
         </w:rPr>
-      </w:pPr>
-      <w:r>
-        <w:rPr>
-          <w:rtl w:val="0"/>
-        </w:rPr>
-      </w:r>
-    </w:p>
-    <w:p>
-      <w:pPr>
-        <w:rPr>
-          <w:color w:val="ff0000"/>
-        </w:rPr>
-      </w:pPr>
-      <w:r>
-        <w:rPr>
-          <w:rtl w:val="0"/>
-        </w:rPr>
-      </w:r>
-    </w:p>
-    <w:p>
-      <w:pPr>
-        <w:rPr>
-          <w:color w:val="ff0000"/>
-        </w:rPr>
-      </w:pPr>
-      <w:r>
-        <w:rPr>
-          <w:rtl w:val="0"/>
-        </w:rPr>
-      </w:r>
-    </w:p>
-    <w:p>
-      <w:pPr>
-        <w:ind w:firstLine="720"/>
-        <w:rPr>
-          <w:color w:val="ff0000"/>
-        </w:rPr>
         <w:sectPr>
-          <w:headerReference r:id="rId10" w:type="default"/>
-          <w:headerReference r:id="rId11" w:type="first"/>
-          <w:footerReference r:id="rId12" w:type="first"/>
+          <w:headerReference r:id="rId8" w:type="default"/>
+          <w:headerReference r:id="rId9" w:type="first"/>
+          <w:footerReference r:id="rId10" w:type="first"/>
           <w:pgSz w:h="16838" w:w="11906" w:orient="portrait"/>
           <w:pgMar w:bottom="1701" w:top="1701" w:left="1701" w:right="1701" w:header="709" w:footer="709"/>
           <w:pgNumType w:start="1"/>
@@ -2508,31 +2756,14 @@
         <w:jc w:val="center"/>
         <w:rPr>
           <w:b w:val="1"/>
-        </w:rPr>
-      </w:pPr>
-      <w:sdt>
-        <w:sdtPr>
-          <w:tag w:val="goog_rdk_2"/>
-        </w:sdtPr>
-        <w:sdtContent>
-          <w:commentRangeStart w:id="2"/>
-        </w:sdtContent>
-      </w:sdt>
-      <w:r>
-        <w:rPr>
-          <w:rtl w:val="0"/>
-        </w:rPr>
-        <w:t xml:space="preserve">M</w:t>
-      </w:r>
-      <w:commentRangeEnd w:id="2"/>
-      <w:r>
-        <w:commentReference w:id="2"/>
-      </w:r>
-      <w:r>
-        <w:rPr>
-          <w:rtl w:val="0"/>
-        </w:rPr>
-        <w:t xml:space="preserve">ETODE PENELITIAN</w:t>
+          <w:bCs w:val="1"/>
+        </w:rPr>
+      </w:pPr>
+      <w:r>
+        <w:rPr>
+          <w:rtl w:val="0"/>
+        </w:rPr>
+        <w:t xml:space="preserve">METODE PENELITIAN</w:t>
       </w:r>
       <w:r>
         <w:rPr>
@@ -2568,6 +2799,7 @@
         <w:jc w:val="center"/>
         <w:rPr>
           <w:b w:val="1"/>
+          <w:bCs w:val="1"/>
         </w:rPr>
       </w:pPr>
       <w:r>
@@ -2587,6 +2819,7 @@
         <w:ind w:firstLine="360"/>
         <w:rPr>
           <w:b w:val="1"/>
+          <w:bCs w:val="1"/>
           <w:color w:val="ff0000"/>
         </w:rPr>
         <w:sectPr>
@@ -2600,7 +2833,7 @@
           <w:color w:val="ff0000"/>
           <w:rtl w:val="0"/>
         </w:rPr>
-        <w:t xml:space="preserve">Bagian ini menjelaskan tentang apa saja yang diperoleh dari observasi. Data dapat diringkas dalam bentuk tabel dan  gambar. Tidak ada spekulasi dan interpretasi dalam bagian ini, yang ada hanya fakta. Umumnya berisi uraian dan analisis berkaitan dengan temuan-temuan dari observasi yang telah dilakukan, terutama dalam konteks yang berhubungan dengan apa yang pernah dilakukan oleh orang lain. Interpretasi dan ketajaman analisis dari penulis terhadap hasil yang diperoleh dikemukakan di sini, termasuk pembahasan tentang pertanyaan-pertanyaan yang timbul dari hasil observasi serta dugaan ilmiah yang dapat bermanfaat untuk kelanjutan bagi penelitian mendatang. Pemecahan masalah yang berhasil dilakukan, perbedaan dan persamaan dari hasil pengamatan terhadap informasi yang ditemukan dalam berbagai pustaka (penelitian terdahulu) perlu mendapatkan catatan disini. Hasil dan Pembahasan handaknya menjadi satu kesatuan, dan tidak dipisah menjadi subbab tersendiri.</w:t>
+        <w:t xml:space="preserve">Bagian ini menjelaskan tentang apa saja yang diperoleh dari observasi. Data dapat diringkas dalam bentuk tabel dan  gambar. Tidak ada spekulasi dan interpretasi dalam bagian ini, yang ada hanya fakta. Umumnya berisi uraian dan analisis berkaitan dengan temuan-temuan dari observasi yang telah dilakukan, terutama dalam konteks yang berhubungan dengan apa yang pernah dilakukan oleh orang lain. Interpretasi dan ketajaman analisis dari penulis terhadap hasil yang diperoleh dikemukakan di sini, termasuk pembahasan tentang pertanyaan-pertanyaan yang timbul dari hasil observasi serta dugaan ilmiah yang dapat bermanfaat untuk kelanjutan bagi penelitian mendatang. Pemecahan masalah yang berhasil dilakukan, perbedaan dan persamaan dari hasil pengamatan terhadap informasi yang ditemukan dalam berbagai pustaka (penelitian terdahulu) perlu mendapatkan catatan disini. Hasil dan Pembahasan hendaknya menjadi satu kesatuan, dan tidak dipisah menjadi sub bab tersendiri.</w:t>
       </w:r>
       <w:r>
         <w:rPr>
@@ -2616,6 +2849,7 @@
         <w:jc w:val="center"/>
         <w:rPr>
           <w:b w:val="1"/>
+          <w:bCs w:val="1"/>
         </w:rPr>
       </w:pPr>
       <w:bookmarkStart w:colFirst="0" w:colLast="0" w:name="_heading=h.30j0zll" w:id="0"/>
@@ -2637,6 +2871,7 @@
         <w:ind w:firstLine="360"/>
         <w:rPr>
           <w:b w:val="1"/>
+          <w:bCs w:val="1"/>
           <w:color w:val="ff0000"/>
         </w:rPr>
         <w:sectPr>
@@ -2663,11 +2898,13 @@
         <w:pStyle w:val="Title"/>
         <w:rPr>
           <w:b w:val="1"/>
+          <w:bCs w:val="1"/>
         </w:rPr>
       </w:pPr>
       <w:r>
         <w:rPr>
           <w:b w:val="1"/>
+          <w:bCs w:val="1"/>
           <w:rtl w:val="0"/>
         </w:rPr>
         <w:t xml:space="preserve">UCAPAN TERIMA KASIH</w:t>
@@ -2707,11 +2944,13 @@
         <w:spacing w:after="0" w:lineRule="auto"/>
         <w:rPr>
           <w:b w:val="1"/>
+          <w:bCs w:val="1"/>
         </w:rPr>
       </w:pPr>
       <w:r>
         <w:rPr>
           <w:b w:val="1"/>
+          <w:bCs w:val="1"/>
           <w:rtl w:val="0"/>
         </w:rPr>
         <w:t xml:space="preserve">DAFTAR PUSTAKA</w:t>
@@ -2742,6 +2981,7 @@
         <w:jc w:val="left"/>
         <w:rPr>
           <w:b w:val="1"/>
+          <w:bCs w:val="1"/>
         </w:rPr>
       </w:pPr>
       <w:r>
@@ -2766,11 +3006,13 @@
         <w:pStyle w:val="Title"/>
         <w:rPr>
           <w:b w:val="1"/>
+          <w:bCs w:val="1"/>
         </w:rPr>
       </w:pPr>
       <w:r>
         <w:rPr>
           <w:b w:val="1"/>
+          <w:bCs w:val="1"/>
           <w:rtl w:val="0"/>
         </w:rPr>
         <w:t xml:space="preserve">*LAMPIRAN-LAMPIRAN</w:t>
@@ -2783,18 +3025,6 @@
         <w:rPr>
           <w:color w:val="ff0000"/>
         </w:rPr>
-      </w:pPr>
-      <w:r>
-        <w:rPr>
-          <w:color w:val="ff0000"/>
-          <w:rtl w:val="0"/>
-        </w:rPr>
-        <w:t xml:space="preserve">(* dapat berupa foto/gambar pembuktian untuk memperkuat penelitian. Misal kawasan/ptoduk/objek yang diteliti).</w:t>
-      </w:r>
-    </w:p>
-    <w:p>
-      <w:pPr>
-        <w:rPr/>
         <w:sectPr>
           <w:type w:val="nextPage"/>
           <w:pgSz w:h="16838" w:w="11906" w:orient="portrait"/>
@@ -2803,8 +3033,10 @@
       </w:pPr>
       <w:r>
         <w:rPr>
-          <w:rtl w:val="0"/>
-        </w:rPr>
+          <w:color w:val="ff0000"/>
+          <w:rtl w:val="0"/>
+        </w:rPr>
+        <w:t xml:space="preserve">(* dapat berupa foto/gambar pembuktian untuk memperkuat penelitian. Misal kawasan/produk/objek yang diteliti).</w:t>
       </w:r>
     </w:p>
     <w:p>
@@ -2812,6 +3044,7 @@
         <w:jc w:val="left"/>
         <w:rPr>
           <w:b w:val="1"/>
+          <w:bCs w:val="1"/>
           <w:sz w:val="28"/>
           <w:szCs w:val="28"/>
         </w:rPr>
@@ -2827,6 +3060,7 @@
         <w:jc w:val="center"/>
         <w:rPr>
           <w:b w:val="1"/>
+          <w:bCs w:val="1"/>
         </w:rPr>
       </w:pPr>
       <w:r>
@@ -2844,174 +3078,8 @@
 </w:document>
 </file>
 
-<file path=word/comments.xml><?xml version="1.0" encoding="utf-8"?>
-<w:comments xmlns:mc="http://schemas.openxmlformats.org/markup-compatibility/2006" xmlns:o="urn:schemas-microsoft-com:office:office" xmlns:r="http://schemas.openxmlformats.org/officeDocument/2006/relationships" xmlns:m="http://schemas.openxmlformats.org/officeDocument/2006/math" xmlns:v="urn:schemas-microsoft-com:vml" xmlns:wp="http://schemas.openxmlformats.org/drawingml/2006/wordprocessingDrawing" xmlns:w10="urn:schemas-microsoft-com:office:word" xmlns:w="http://schemas.openxmlformats.org/wordprocessingml/2006/main" xmlns:wne="http://schemas.microsoft.com/office/word/2006/wordml" xmlns:sl="http://schemas.openxmlformats.org/schemaLibrary/2006/main" xmlns:a="http://schemas.openxmlformats.org/drawingml/2006/main" xmlns:pic="http://schemas.openxmlformats.org/drawingml/2006/picture" xmlns:c="http://schemas.openxmlformats.org/drawingml/2006/chart" xmlns:lc="http://schemas.openxmlformats.org/drawingml/2006/lockedCanvas" xmlns:dgm="http://schemas.openxmlformats.org/drawingml/2006/diagram" xmlns:wps="http://schemas.microsoft.com/office/word/2010/wordprocessingShape" xmlns:wpg="http://schemas.microsoft.com/office/word/2010/wordprocessingGroup" xmlns:w14="http://schemas.microsoft.com/office/word/2010/wordml" xmlns:w15="http://schemas.microsoft.com/office/word/2012/wordml">
-  <w:comment w:author="Chintya Dewi Puspita Sari" w:id="2" w:date="2024-02-16T12:16:21Z">
-    <w:p>
-      <w:pPr>
-        <w:keepNext w:val="0"/>
-        <w:keepLines w:val="0"/>
-        <w:pageBreakBefore w:val="0"/>
-        <w:widowControl w:val="0"/>
-        <w:pBdr>
-          <w:top w:space="0" w:sz="0" w:val="nil"/>
-          <w:left w:space="0" w:sz="0" w:val="nil"/>
-          <w:bottom w:space="0" w:sz="0" w:val="nil"/>
-          <w:right w:space="0" w:sz="0" w:val="nil"/>
-          <w:between w:space="0" w:sz="0" w:val="nil"/>
-        </w:pBdr>
-        <w:shd w:fill="auto" w:val="clear"/>
-        <w:spacing w:after="0" w:before="0" w:line="240" w:lineRule="auto"/>
-        <w:ind w:left="0" w:right="0" w:firstLine="0"/>
-        <w:jc w:val="left"/>
-        <w:rPr>
-          <w:rFonts w:ascii="Arial" w:cs="Arial" w:eastAsia="Arial" w:hAnsi="Arial"/>
-          <w:b w:val="0"/>
-          <w:i w:val="0"/>
-          <w:smallCaps w:val="0"/>
-          <w:strike w:val="0"/>
-          <w:color w:val="000000"/>
-          <w:sz w:val="22"/>
-          <w:szCs w:val="22"/>
-          <w:u w:val="none"/>
-          <w:shd w:fill="auto" w:val="clear"/>
-          <w:vertAlign w:val="baseline"/>
-        </w:rPr>
-      </w:pPr>
-      <w:r>
-        <w:rPr>
-          <w:rFonts w:ascii="Arial" w:cs="Arial" w:eastAsia="Arial" w:hAnsi="Arial"/>
-          <w:b w:val="0"/>
-          <w:i w:val="0"/>
-          <w:smallCaps w:val="0"/>
-          <w:strike w:val="0"/>
-          <w:color w:val="000000"/>
-          <w:sz w:val="22"/>
-          <w:szCs w:val="22"/>
-          <w:u w:val="none"/>
-          <w:shd w:fill="auto" w:val="clear"/>
-          <w:vertAlign w:val="baseline"/>
-          <w:rtl w:val="0"/>
-        </w:rPr>
-        <w:t xml:space="preserve">poin ini harusnya 'Metode penelitian'. Keterangan bisa liat di pedoman gemastik 2024. begitu pula dengan poin-poin yang ada di bawah, disesuaikan lagi ya</w:t>
-      </w:r>
-    </w:p>
-  </w:comment>
-  <w:comment w:author="Chintya Dewi Puspita Sari" w:id="1" w:date="2024-02-16T12:14:12Z">
-    <w:p>
-      <w:pPr>
-        <w:keepNext w:val="0"/>
-        <w:keepLines w:val="0"/>
-        <w:pageBreakBefore w:val="0"/>
-        <w:widowControl w:val="0"/>
-        <w:pBdr>
-          <w:top w:space="0" w:sz="0" w:val="nil"/>
-          <w:left w:space="0" w:sz="0" w:val="nil"/>
-          <w:bottom w:space="0" w:sz="0" w:val="nil"/>
-          <w:right w:space="0" w:sz="0" w:val="nil"/>
-          <w:between w:space="0" w:sz="0" w:val="nil"/>
-        </w:pBdr>
-        <w:shd w:fill="auto" w:val="clear"/>
-        <w:spacing w:after="0" w:before="0" w:line="240" w:lineRule="auto"/>
-        <w:ind w:left="0" w:right="0" w:firstLine="0"/>
-        <w:jc w:val="left"/>
-        <w:rPr>
-          <w:rFonts w:ascii="Arial" w:cs="Arial" w:eastAsia="Arial" w:hAnsi="Arial"/>
-          <w:b w:val="0"/>
-          <w:i w:val="0"/>
-          <w:smallCaps w:val="0"/>
-          <w:strike w:val="0"/>
-          <w:color w:val="000000"/>
-          <w:sz w:val="22"/>
-          <w:szCs w:val="22"/>
-          <w:u w:val="none"/>
-          <w:shd w:fill="auto" w:val="clear"/>
-          <w:vertAlign w:val="baseline"/>
-        </w:rPr>
-      </w:pPr>
-      <w:r>
-        <w:rPr>
-          <w:rFonts w:ascii="Arial" w:cs="Arial" w:eastAsia="Arial" w:hAnsi="Arial"/>
-          <w:b w:val="0"/>
-          <w:i w:val="0"/>
-          <w:smallCaps w:val="0"/>
-          <w:strike w:val="0"/>
-          <w:color w:val="000000"/>
-          <w:sz w:val="22"/>
-          <w:szCs w:val="22"/>
-          <w:u w:val="none"/>
-          <w:shd w:fill="auto" w:val="clear"/>
-          <w:vertAlign w:val="baseline"/>
-          <w:rtl w:val="0"/>
-        </w:rPr>
-        <w:t xml:space="preserve">format dan penjelasan poin disesuaikan dengan rulebook gemastik 2024</w:t>
-      </w:r>
-    </w:p>
-  </w:comment>
-  <w:comment w:author="Chintya Dewi Puspita Sari" w:id="0" w:date="2024-02-16T12:12:15Z">
-    <w:p>
-      <w:pPr>
-        <w:keepNext w:val="0"/>
-        <w:keepLines w:val="0"/>
-        <w:pageBreakBefore w:val="0"/>
-        <w:widowControl w:val="0"/>
-        <w:pBdr>
-          <w:top w:space="0" w:sz="0" w:val="nil"/>
-          <w:left w:space="0" w:sz="0" w:val="nil"/>
-          <w:bottom w:space="0" w:sz="0" w:val="nil"/>
-          <w:right w:space="0" w:sz="0" w:val="nil"/>
-          <w:between w:space="0" w:sz="0" w:val="nil"/>
-        </w:pBdr>
-        <w:shd w:fill="auto" w:val="clear"/>
-        <w:spacing w:after="0" w:before="0" w:line="240" w:lineRule="auto"/>
-        <w:ind w:left="0" w:right="0" w:firstLine="0"/>
-        <w:jc w:val="left"/>
-        <w:rPr>
-          <w:rFonts w:ascii="Arial" w:cs="Arial" w:eastAsia="Arial" w:hAnsi="Arial"/>
-          <w:b w:val="0"/>
-          <w:i w:val="0"/>
-          <w:smallCaps w:val="0"/>
-          <w:strike w:val="0"/>
-          <w:color w:val="000000"/>
-          <w:sz w:val="22"/>
-          <w:szCs w:val="22"/>
-          <w:u w:val="none"/>
-          <w:shd w:fill="auto" w:val="clear"/>
-          <w:vertAlign w:val="baseline"/>
-        </w:rPr>
-      </w:pPr>
-      <w:r>
-        <w:rPr>
-          <w:rFonts w:ascii="Arial" w:cs="Arial" w:eastAsia="Arial" w:hAnsi="Arial"/>
-          <w:b w:val="0"/>
-          <w:i w:val="0"/>
-          <w:smallCaps w:val="0"/>
-          <w:strike w:val="0"/>
-          <w:color w:val="000000"/>
-          <w:sz w:val="22"/>
-          <w:szCs w:val="22"/>
-          <w:u w:val="none"/>
-          <w:shd w:fill="auto" w:val="clear"/>
-          <w:vertAlign w:val="baseline"/>
-          <w:rtl w:val="0"/>
-        </w:rPr>
-        <w:t xml:space="preserve">bulan dan tahunnya disesuaikan dengan timeline pelaksanaan. dicek lagi template bidang lain, kalau salah dibenerin ya</w:t>
-      </w:r>
-    </w:p>
-  </w:comment>
-</w:comments>
-</file>
-
-<file path=word/commentsExtended.xml><?xml version="1.0" encoding="utf-8"?>
-<w15:commentsEx xmlns:mc="http://schemas.openxmlformats.org/markup-compatibility/2006" xmlns:o="urn:schemas-microsoft-com:office:office" xmlns:r="http://schemas.openxmlformats.org/officeDocument/2006/relationships" xmlns:m="http://schemas.openxmlformats.org/officeDocument/2006/math" xmlns:v="urn:schemas-microsoft-com:vml" xmlns:wp="http://schemas.openxmlformats.org/drawingml/2006/wordprocessingDrawing" xmlns:w10="urn:schemas-microsoft-com:office:word" xmlns:w="http://schemas.openxmlformats.org/wordprocessingml/2006/main" xmlns:wne="http://schemas.microsoft.com/office/word/2006/wordml" xmlns:sl="http://schemas.openxmlformats.org/schemaLibrary/2006/main" xmlns:a="http://schemas.openxmlformats.org/drawingml/2006/main" xmlns:pic="http://schemas.openxmlformats.org/drawingml/2006/picture" xmlns:c="http://schemas.openxmlformats.org/drawingml/2006/chart" xmlns:lc="http://schemas.openxmlformats.org/drawingml/2006/lockedCanvas" xmlns:dgm="http://schemas.openxmlformats.org/drawingml/2006/diagram" xmlns:wps="http://schemas.microsoft.com/office/word/2010/wordprocessingShape" xmlns:wpg="http://schemas.microsoft.com/office/word/2010/wordprocessingGroup" xmlns:w14="http://schemas.microsoft.com/office/word/2010/wordml" xmlns:w15="http://schemas.microsoft.com/office/word/2012/wordml">
-  <w15:commentEx w15:paraId="000000B3" w15:done="0"/>
-  <w15:commentEx w15:paraId="000000B4" w15:done="0"/>
-  <w15:commentEx w15:paraId="000000B5" w15:done="0"/>
-</w15:commentsEx>
-</file>
-
 <file path=word/footer1.xml><?xml version="1.0" encoding="utf-8"?>
-<w:ftr xmlns:mc="http://schemas.openxmlformats.org/markup-compatibility/2006" xmlns:o="urn:schemas-microsoft-com:office:office" xmlns:r="http://schemas.openxmlformats.org/officeDocument/2006/relationships" xmlns:m="http://schemas.openxmlformats.org/officeDocument/2006/math" xmlns:v="urn:schemas-microsoft-com:vml" xmlns:wp="http://schemas.openxmlformats.org/drawingml/2006/wordprocessingDrawing" xmlns:w10="urn:schemas-microsoft-com:office:word" xmlns:w="http://schemas.openxmlformats.org/wordprocessingml/2006/main" xmlns:wne="http://schemas.microsoft.com/office/word/2006/wordml" xmlns:sl="http://schemas.openxmlformats.org/schemaLibrary/2006/main" xmlns:a="http://schemas.openxmlformats.org/drawingml/2006/main" xmlns:pic="http://schemas.openxmlformats.org/drawingml/2006/picture" xmlns:c="http://schemas.openxmlformats.org/drawingml/2006/chart" xmlns:lc="http://schemas.openxmlformats.org/drawingml/2006/lockedCanvas" xmlns:dgm="http://schemas.openxmlformats.org/drawingml/2006/diagram" xmlns:wps="http://schemas.microsoft.com/office/word/2010/wordprocessingShape" xmlns:wpg="http://schemas.microsoft.com/office/word/2010/wordprocessingGroup" xmlns:w14="http://schemas.microsoft.com/office/word/2010/wordml" xmlns:w15="http://schemas.microsoft.com/office/word/2012/wordml">
+<w:ftr xmlns:mc="http://schemas.openxmlformats.org/markup-compatibility/2006" xmlns:o="urn:schemas-microsoft-com:office:office" xmlns:r="http://schemas.openxmlformats.org/officeDocument/2006/relationships" xmlns:m="http://schemas.openxmlformats.org/officeDocument/2006/math" xmlns:v="urn:schemas-microsoft-com:vml" xmlns:wp="http://schemas.openxmlformats.org/drawingml/2006/wordprocessingDrawing" xmlns:w10="urn:schemas-microsoft-com:office:word" xmlns:w="http://schemas.openxmlformats.org/wordprocessingml/2006/main" xmlns:wne="http://schemas.microsoft.com/office/word/2006/wordml" xmlns:sl="http://schemas.openxmlformats.org/schemaLibrary/2006/main" xmlns:a="http://schemas.openxmlformats.org/drawingml/2006/main" xmlns:pic="http://schemas.openxmlformats.org/drawingml/2006/picture" xmlns:c="http://schemas.openxmlformats.org/drawingml/2006/chart" xmlns:lc="http://schemas.openxmlformats.org/drawingml/2006/lockedCanvas" xmlns:dgm="http://schemas.openxmlformats.org/drawingml/2006/diagram" xmlns:wps="http://schemas.microsoft.com/office/word/2010/wordprocessingShape" xmlns:wpg="http://schemas.microsoft.com/office/word/2010/wordprocessingGroup" xmlns:w14="http://schemas.microsoft.com/office/word/2010/wordml" xmlns:w15="http://schemas.microsoft.com/office/word/2012/wordml" xmlns:w16="http://schemas.microsoft.com/office/word/2018/wordml" xmlns:w16cex="http://schemas.microsoft.com/office/word/2018/wordml/cex" xmlns:w16cid="http://schemas.microsoft.com/office/word/2016/wordml/cid" xmlns="http://schemas.microsoft.com/office/tasks/2019/documenttasks" xmlns:cr="http://schemas.microsoft.com/office/comments/2020/reactions">
   <w:p>
     <w:pPr>
       <w:rPr/>
@@ -3026,7 +3094,7 @@
 </file>
 
 <file path=word/header1.xml><?xml version="1.0" encoding="utf-8"?>
-<w:hdr xmlns:mc="http://schemas.openxmlformats.org/markup-compatibility/2006" xmlns:o="urn:schemas-microsoft-com:office:office" xmlns:r="http://schemas.openxmlformats.org/officeDocument/2006/relationships" xmlns:m="http://schemas.openxmlformats.org/officeDocument/2006/math" xmlns:v="urn:schemas-microsoft-com:vml" xmlns:wp="http://schemas.openxmlformats.org/drawingml/2006/wordprocessingDrawing" xmlns:w10="urn:schemas-microsoft-com:office:word" xmlns:w="http://schemas.openxmlformats.org/wordprocessingml/2006/main" xmlns:wne="http://schemas.microsoft.com/office/word/2006/wordml" xmlns:sl="http://schemas.openxmlformats.org/schemaLibrary/2006/main" xmlns:a="http://schemas.openxmlformats.org/drawingml/2006/main" xmlns:pic="http://schemas.openxmlformats.org/drawingml/2006/picture" xmlns:c="http://schemas.openxmlformats.org/drawingml/2006/chart" xmlns:lc="http://schemas.openxmlformats.org/drawingml/2006/lockedCanvas" xmlns:dgm="http://schemas.openxmlformats.org/drawingml/2006/diagram" xmlns:wps="http://schemas.microsoft.com/office/word/2010/wordprocessingShape" xmlns:wpg="http://schemas.microsoft.com/office/word/2010/wordprocessingGroup" xmlns:w14="http://schemas.microsoft.com/office/word/2010/wordml" xmlns:w15="http://schemas.microsoft.com/office/word/2012/wordml">
+<w:hdr xmlns:mc="http://schemas.openxmlformats.org/markup-compatibility/2006" xmlns:o="urn:schemas-microsoft-com:office:office" xmlns:r="http://schemas.openxmlformats.org/officeDocument/2006/relationships" xmlns:m="http://schemas.openxmlformats.org/officeDocument/2006/math" xmlns:v="urn:schemas-microsoft-com:vml" xmlns:wp="http://schemas.openxmlformats.org/drawingml/2006/wordprocessingDrawing" xmlns:w10="urn:schemas-microsoft-com:office:word" xmlns:w="http://schemas.openxmlformats.org/wordprocessingml/2006/main" xmlns:wne="http://schemas.microsoft.com/office/word/2006/wordml" xmlns:sl="http://schemas.openxmlformats.org/schemaLibrary/2006/main" xmlns:a="http://schemas.openxmlformats.org/drawingml/2006/main" xmlns:pic="http://schemas.openxmlformats.org/drawingml/2006/picture" xmlns:c="http://schemas.openxmlformats.org/drawingml/2006/chart" xmlns:lc="http://schemas.openxmlformats.org/drawingml/2006/lockedCanvas" xmlns:dgm="http://schemas.openxmlformats.org/drawingml/2006/diagram" xmlns:wps="http://schemas.microsoft.com/office/word/2010/wordprocessingShape" xmlns:wpg="http://schemas.microsoft.com/office/word/2010/wordprocessingGroup" xmlns:w14="http://schemas.microsoft.com/office/word/2010/wordml" xmlns:w15="http://schemas.microsoft.com/office/word/2012/wordml" xmlns:w16="http://schemas.microsoft.com/office/word/2018/wordml" xmlns:w16cex="http://schemas.microsoft.com/office/word/2018/wordml/cex" xmlns:w16cid="http://schemas.microsoft.com/office/word/2016/wordml/cid" xmlns="http://schemas.microsoft.com/office/tasks/2019/documenttasks" xmlns:cr="http://schemas.microsoft.com/office/comments/2020/reactions">
   <w:p>
     <w:pPr>
       <w:shd w:fill="ffffff" w:val="clear"/>
@@ -3034,6 +3102,45 @@
       <w:jc w:val="center"/>
       <w:rPr>
         <w:b w:val="1"/>
+        <w:bCs w:val="1"/>
+        <w:sz w:val="28"/>
+        <w:szCs w:val="28"/>
+      </w:rPr>
+    </w:pPr>
+    <w:r>
+      <w:rPr>
+        <w:rtl w:val="0"/>
+      </w:rPr>
+    </w:r>
+  </w:p>
+  <w:p>
+    <w:pPr>
+      <w:rPr>
+        <w:b w:val="1"/>
+        <w:bCs w:val="1"/>
+        <w:sz w:val="28"/>
+        <w:szCs w:val="28"/>
+      </w:rPr>
+    </w:pPr>
+    <w:r>
+      <w:rPr>
+        <w:rtl w:val="0"/>
+      </w:rPr>
+    </w:r>
+  </w:p>
+</w:hdr>
+</file>
+
+<file path=word/header2.xml><?xml version="1.0" encoding="utf-8"?>
+<w:hdr xmlns:mc="http://schemas.openxmlformats.org/markup-compatibility/2006" xmlns:o="urn:schemas-microsoft-com:office:office" xmlns:r="http://schemas.openxmlformats.org/officeDocument/2006/relationships" xmlns:m="http://schemas.openxmlformats.org/officeDocument/2006/math" xmlns:v="urn:schemas-microsoft-com:vml" xmlns:wp="http://schemas.openxmlformats.org/drawingml/2006/wordprocessingDrawing" xmlns:w10="urn:schemas-microsoft-com:office:word" xmlns:w="http://schemas.openxmlformats.org/wordprocessingml/2006/main" xmlns:wne="http://schemas.microsoft.com/office/word/2006/wordml" xmlns:sl="http://schemas.openxmlformats.org/schemaLibrary/2006/main" xmlns:a="http://schemas.openxmlformats.org/drawingml/2006/main" xmlns:pic="http://schemas.openxmlformats.org/drawingml/2006/picture" xmlns:c="http://schemas.openxmlformats.org/drawingml/2006/chart" xmlns:lc="http://schemas.openxmlformats.org/drawingml/2006/lockedCanvas" xmlns:dgm="http://schemas.openxmlformats.org/drawingml/2006/diagram" xmlns:wps="http://schemas.microsoft.com/office/word/2010/wordprocessingShape" xmlns:wpg="http://schemas.microsoft.com/office/word/2010/wordprocessingGroup" xmlns:w14="http://schemas.microsoft.com/office/word/2010/wordml" xmlns:w15="http://schemas.microsoft.com/office/word/2012/wordml" xmlns:w16="http://schemas.microsoft.com/office/word/2018/wordml" xmlns:w16cex="http://schemas.microsoft.com/office/word/2018/wordml/cex" xmlns:w16cid="http://schemas.microsoft.com/office/word/2016/wordml/cid" xmlns="http://schemas.microsoft.com/office/tasks/2019/documenttasks" xmlns:cr="http://schemas.microsoft.com/office/comments/2020/reactions">
+  <w:p>
+    <w:pPr>
+      <w:shd w:fill="ffffff" w:val="clear"/>
+      <w:spacing w:after="280" w:line="240" w:lineRule="auto"/>
+      <w:jc w:val="center"/>
+      <w:rPr>
+        <w:b w:val="1"/>
+        <w:bCs w:val="1"/>
         <w:sz w:val="28"/>
         <w:szCs w:val="28"/>
       </w:rPr>
@@ -3048,20 +3155,20 @@
         <wp:anchor allowOverlap="1" behindDoc="0" distB="114300" distT="114300" distL="114300" distR="114300" hidden="0" layoutInCell="1" locked="0" relativeHeight="0" simplePos="0">
           <wp:simplePos x="0" y="0"/>
           <wp:positionH relativeFrom="column">
-            <wp:posOffset>1038225</wp:posOffset>
+            <wp:posOffset>981075</wp:posOffset>
           </wp:positionH>
           <wp:positionV relativeFrom="paragraph">
-            <wp:posOffset>-76199</wp:posOffset>
+            <wp:posOffset>-171448</wp:posOffset>
           </wp:positionV>
-          <wp:extent cx="1020128" cy="493062"/>
+          <wp:extent cx="590550" cy="638175"/>
           <wp:effectExtent b="0" l="0" r="0" t="0"/>
-          <wp:wrapNone/>
-          <wp:docPr id="25" name="image4.png"/>
+          <wp:wrapSquare wrapText="bothSides" distB="114300" distT="114300" distL="114300" distR="114300"/>
+          <wp:docPr id="37" name="image3.png"/>
           <a:graphic>
             <a:graphicData uri="http://schemas.openxmlformats.org/drawingml/2006/picture">
               <pic:pic>
                 <pic:nvPicPr>
-                  <pic:cNvPr id="0" name="image4.png"/>
+                  <pic:cNvPr id="0" name="image3.png"/>
                   <pic:cNvPicPr preferRelativeResize="0"/>
                 </pic:nvPicPr>
                 <pic:blipFill>
@@ -3074,7 +3181,7 @@
                 <pic:spPr>
                   <a:xfrm>
                     <a:off x="0" y="0"/>
-                    <a:ext cx="1020128" cy="493062"/>
+                    <a:ext cx="590550" cy="638175"/>
                   </a:xfrm>
                   <a:prstGeom prst="rect"/>
                   <a:ln/>
@@ -3090,20 +3197,20 @@
         <wp:anchor allowOverlap="1" behindDoc="0" distB="0" distT="0" distL="0" distR="0" hidden="0" layoutInCell="1" locked="0" relativeHeight="0" simplePos="0">
           <wp:simplePos x="0" y="0"/>
           <wp:positionH relativeFrom="column">
-            <wp:posOffset>-600071</wp:posOffset>
+            <wp:posOffset>-600068</wp:posOffset>
           </wp:positionH>
           <wp:positionV relativeFrom="paragraph">
-            <wp:posOffset>-161921</wp:posOffset>
+            <wp:posOffset>-161918</wp:posOffset>
           </wp:positionV>
           <wp:extent cx="686753" cy="668192"/>
           <wp:effectExtent b="0" l="0" r="0" t="0"/>
           <wp:wrapNone/>
-          <wp:docPr id="24" name="image1.png"/>
+          <wp:docPr id="36" name="image2.png"/>
           <a:graphic>
             <a:graphicData uri="http://schemas.openxmlformats.org/drawingml/2006/picture">
               <pic:pic>
                 <pic:nvPicPr>
-                  <pic:cNvPr id="0" name="image1.png"/>
+                  <pic:cNvPr id="0" name="image2.png"/>
                   <pic:cNvPicPr preferRelativeResize="0"/>
                 </pic:nvPicPr>
                 <pic:blipFill>
@@ -3135,22 +3242,22 @@
             <wp:posOffset>190500</wp:posOffset>
           </wp:positionH>
           <wp:positionV relativeFrom="paragraph">
-            <wp:posOffset>-171446</wp:posOffset>
+            <wp:posOffset>-171443</wp:posOffset>
           </wp:positionV>
           <wp:extent cx="685800" cy="685800"/>
           <wp:effectExtent b="0" l="0" r="0" t="0"/>
           <wp:wrapNone/>
-          <wp:docPr id="23" name="image2.png"/>
+          <wp:docPr id="35" name="image4.png"/>
           <a:graphic>
             <a:graphicData uri="http://schemas.openxmlformats.org/drawingml/2006/picture">
               <pic:pic>
                 <pic:nvPicPr>
-                  <pic:cNvPr id="0" name="image2.png"/>
+                  <pic:cNvPr id="0" name="image4.png"/>
                   <pic:cNvPicPr preferRelativeResize="0"/>
                 </pic:nvPicPr>
                 <pic:blipFill>
                   <a:blip r:embed="rId3"/>
-                  <a:srcRect b="0" l="0" r="0" t="0"/>
+                  <a:srcRect b="0" l="8537" r="8537" t="0"/>
                   <a:stretch>
                     <a:fillRect/>
                   </a:stretch>
@@ -3193,7 +3300,9 @@
       <w:rPr>
         <w:rFonts w:ascii="Times New Roman" w:cs="Times New Roman" w:eastAsia="Times New Roman" w:hAnsi="Times New Roman"/>
         <w:b w:val="0"/>
+        <w:bCs w:val="0"/>
         <w:i w:val="0"/>
+        <w:iCs w:val="0"/>
         <w:smallCaps w:val="0"/>
         <w:strike w:val="0"/>
         <w:color w:val="000000"/>
@@ -3213,54 +3322,18 @@
 </w:hdr>
 </file>
 
-<file path=word/header2.xml><?xml version="1.0" encoding="utf-8"?>
-<w:hdr xmlns:mc="http://schemas.openxmlformats.org/markup-compatibility/2006" xmlns:o="urn:schemas-microsoft-com:office:office" xmlns:r="http://schemas.openxmlformats.org/officeDocument/2006/relationships" xmlns:m="http://schemas.openxmlformats.org/officeDocument/2006/math" xmlns:v="urn:schemas-microsoft-com:vml" xmlns:wp="http://schemas.openxmlformats.org/drawingml/2006/wordprocessingDrawing" xmlns:w10="urn:schemas-microsoft-com:office:word" xmlns:w="http://schemas.openxmlformats.org/wordprocessingml/2006/main" xmlns:wne="http://schemas.microsoft.com/office/word/2006/wordml" xmlns:sl="http://schemas.openxmlformats.org/schemaLibrary/2006/main" xmlns:a="http://schemas.openxmlformats.org/drawingml/2006/main" xmlns:pic="http://schemas.openxmlformats.org/drawingml/2006/picture" xmlns:c="http://schemas.openxmlformats.org/drawingml/2006/chart" xmlns:lc="http://schemas.openxmlformats.org/drawingml/2006/lockedCanvas" xmlns:dgm="http://schemas.openxmlformats.org/drawingml/2006/diagram" xmlns:wps="http://schemas.microsoft.com/office/word/2010/wordprocessingShape" xmlns:wpg="http://schemas.microsoft.com/office/word/2010/wordprocessingGroup" xmlns:w14="http://schemas.microsoft.com/office/word/2010/wordml" xmlns:w15="http://schemas.microsoft.com/office/word/2012/wordml">
-  <w:p>
-    <w:pPr>
-      <w:shd w:fill="ffffff" w:val="clear"/>
-      <w:spacing w:after="280" w:line="240" w:lineRule="auto"/>
-      <w:jc w:val="center"/>
-      <w:rPr>
-        <w:b w:val="1"/>
-        <w:sz w:val="28"/>
-        <w:szCs w:val="28"/>
-      </w:rPr>
-    </w:pPr>
-    <w:r>
-      <w:rPr>
-        <w:rtl w:val="0"/>
-      </w:rPr>
-    </w:r>
-  </w:p>
-  <w:p>
-    <w:pPr>
-      <w:rPr>
-        <w:b w:val="1"/>
-        <w:sz w:val="28"/>
-        <w:szCs w:val="28"/>
-      </w:rPr>
-    </w:pPr>
-    <w:r>
-      <w:rPr>
-        <w:rtl w:val="0"/>
-      </w:rPr>
-    </w:r>
-  </w:p>
-</w:hdr>
-</file>
-
 <file path=word/numbering.xml><?xml version="1.0" encoding="utf-8"?>
-<w:numbering xmlns:mc="http://schemas.openxmlformats.org/markup-compatibility/2006" xmlns:o="urn:schemas-microsoft-com:office:office" xmlns:r="http://schemas.openxmlformats.org/officeDocument/2006/relationships" xmlns:m="http://schemas.openxmlformats.org/officeDocument/2006/math" xmlns:v="urn:schemas-microsoft-com:vml" xmlns:wp="http://schemas.openxmlformats.org/drawingml/2006/wordprocessingDrawing" xmlns:w10="urn:schemas-microsoft-com:office:word" xmlns:w="http://schemas.openxmlformats.org/wordprocessingml/2006/main" xmlns:wne="http://schemas.microsoft.com/office/word/2006/wordml" xmlns:sl="http://schemas.openxmlformats.org/schemaLibrary/2006/main" xmlns:a="http://schemas.openxmlformats.org/drawingml/2006/main" xmlns:pic="http://schemas.openxmlformats.org/drawingml/2006/picture" xmlns:c="http://schemas.openxmlformats.org/drawingml/2006/chart" xmlns:lc="http://schemas.openxmlformats.org/drawingml/2006/lockedCanvas" xmlns:dgm="http://schemas.openxmlformats.org/drawingml/2006/diagram" xmlns:wps="http://schemas.microsoft.com/office/word/2010/wordprocessingShape" xmlns:wpg="http://schemas.microsoft.com/office/word/2010/wordprocessingGroup" xmlns:w14="http://schemas.microsoft.com/office/word/2010/wordml" xmlns:w15="http://schemas.microsoft.com/office/word/2012/wordml"/>
+<w:numbering xmlns:mc="http://schemas.openxmlformats.org/markup-compatibility/2006" xmlns:o="urn:schemas-microsoft-com:office:office" xmlns:r="http://schemas.openxmlformats.org/officeDocument/2006/relationships" xmlns:m="http://schemas.openxmlformats.org/officeDocument/2006/math" xmlns:v="urn:schemas-microsoft-com:vml" xmlns:wp="http://schemas.openxmlformats.org/drawingml/2006/wordprocessingDrawing" xmlns:w10="urn:schemas-microsoft-com:office:word" xmlns:w="http://schemas.openxmlformats.org/wordprocessingml/2006/main" xmlns:wne="http://schemas.microsoft.com/office/word/2006/wordml" xmlns:sl="http://schemas.openxmlformats.org/schemaLibrary/2006/main" xmlns:a="http://schemas.openxmlformats.org/drawingml/2006/main" xmlns:pic="http://schemas.openxmlformats.org/drawingml/2006/picture" xmlns:c="http://schemas.openxmlformats.org/drawingml/2006/chart" xmlns:lc="http://schemas.openxmlformats.org/drawingml/2006/lockedCanvas" xmlns:dgm="http://schemas.openxmlformats.org/drawingml/2006/diagram" xmlns:wps="http://schemas.microsoft.com/office/word/2010/wordprocessingShape" xmlns:wpg="http://schemas.microsoft.com/office/word/2010/wordprocessingGroup" xmlns:w14="http://schemas.microsoft.com/office/word/2010/wordml" xmlns:w15="http://schemas.microsoft.com/office/word/2012/wordml" xmlns:w16="http://schemas.microsoft.com/office/word/2018/wordml" xmlns:w16cex="http://schemas.microsoft.com/office/word/2018/wordml/cex" xmlns:w16cid="http://schemas.microsoft.com/office/word/2016/wordml/cid" xmlns="http://schemas.microsoft.com/office/tasks/2019/documenttasks" xmlns:cr="http://schemas.microsoft.com/office/comments/2020/reactions"/>
 </file>
 
 <file path=word/styles.xml><?xml version="1.0" encoding="utf-8"?>
-<w:styles xmlns:mc="http://schemas.openxmlformats.org/markup-compatibility/2006" xmlns:o="urn:schemas-microsoft-com:office:office" xmlns:r="http://schemas.openxmlformats.org/officeDocument/2006/relationships" xmlns:m="http://schemas.openxmlformats.org/officeDocument/2006/math" xmlns:v="urn:schemas-microsoft-com:vml" xmlns:wp="http://schemas.openxmlformats.org/drawingml/2006/wordprocessingDrawing" xmlns:w10="urn:schemas-microsoft-com:office:word" xmlns:w="http://schemas.openxmlformats.org/wordprocessingml/2006/main" xmlns:wne="http://schemas.microsoft.com/office/word/2006/wordml" xmlns:sl="http://schemas.openxmlformats.org/schemaLibrary/2006/main" xmlns:a="http://schemas.openxmlformats.org/drawingml/2006/main" xmlns:pic="http://schemas.openxmlformats.org/drawingml/2006/picture" xmlns:c="http://schemas.openxmlformats.org/drawingml/2006/chart" xmlns:lc="http://schemas.openxmlformats.org/drawingml/2006/lockedCanvas" xmlns:dgm="http://schemas.openxmlformats.org/drawingml/2006/diagram" xmlns:wps="http://schemas.microsoft.com/office/word/2010/wordprocessingShape" xmlns:wpg="http://schemas.microsoft.com/office/word/2010/wordprocessingGroup" xmlns:w14="http://schemas.microsoft.com/office/word/2010/wordml" xmlns:w15="http://schemas.microsoft.com/office/word/2012/wordml">
+<w:styles xmlns:mc="http://schemas.openxmlformats.org/markup-compatibility/2006" xmlns:o="urn:schemas-microsoft-com:office:office" xmlns:r="http://schemas.openxmlformats.org/officeDocument/2006/relationships" xmlns:m="http://schemas.openxmlformats.org/officeDocument/2006/math" xmlns:v="urn:schemas-microsoft-com:vml" xmlns:wp="http://schemas.openxmlformats.org/drawingml/2006/wordprocessingDrawing" xmlns:w10="urn:schemas-microsoft-com:office:word" xmlns:w="http://schemas.openxmlformats.org/wordprocessingml/2006/main" xmlns:wne="http://schemas.microsoft.com/office/word/2006/wordml" xmlns:sl="http://schemas.openxmlformats.org/schemaLibrary/2006/main" xmlns:a="http://schemas.openxmlformats.org/drawingml/2006/main" xmlns:pic="http://schemas.openxmlformats.org/drawingml/2006/picture" xmlns:c="http://schemas.openxmlformats.org/drawingml/2006/chart" xmlns:lc="http://schemas.openxmlformats.org/drawingml/2006/lockedCanvas" xmlns:dgm="http://schemas.openxmlformats.org/drawingml/2006/diagram" xmlns:wps="http://schemas.microsoft.com/office/word/2010/wordprocessingShape" xmlns:wpg="http://schemas.microsoft.com/office/word/2010/wordprocessingGroup" xmlns:w14="http://schemas.microsoft.com/office/word/2010/wordml" xmlns:w15="http://schemas.microsoft.com/office/word/2012/wordml" xmlns:w16="http://schemas.microsoft.com/office/word/2018/wordml" xmlns:w16cex="http://schemas.microsoft.com/office/word/2018/wordml/cex" xmlns:w16cid="http://schemas.microsoft.com/office/word/2016/wordml/cid" xmlns="http://schemas.microsoft.com/office/tasks/2019/documenttasks" xmlns:cr="http://schemas.microsoft.com/office/comments/2020/reactions">
   <w:docDefaults>
     <w:rPrDefault>
       <w:rPr>
         <w:sz w:val="24"/>
         <w:szCs w:val="24"/>
-        <w:lang w:val="id-ID"/>
+        <w:lang w:val="id"/>
       </w:rPr>
     </w:rPrDefault>
     <w:pPrDefault>
@@ -3270,11 +3343,19 @@
       </w:pPr>
     </w:pPrDefault>
   </w:docDefaults>
+  <w:style w:type="table" w:styleId="TableNormal" w:default="1">
+    <w:name w:val="TableNormal"/>
+    <w:tblPr>
+      <w:tblCellMar>
+        <w:top w:w="100.0" w:type="dxa"/>
+        <w:left w:w="100.0" w:type="dxa"/>
+        <w:bottom w:w="100.0" w:type="dxa"/>
+        <w:right w:w="100.0" w:type="dxa"/>
+      </w:tblCellMar>
+    </w:tblPr>
+  </w:style>
   <w:style w:type="paragraph" w:styleId="Normal" w:default="1">
     <w:name w:val="normal"/>
-  </w:style>
-  <w:style w:type="table" w:styleId="TableNormal" w:default="1">
-    <w:name w:val="Table Normal"/>
   </w:style>
   <w:style w:type="paragraph" w:styleId="Heading1">
     <w:name w:val="heading 1"/>
@@ -3287,6 +3368,7 @@
     </w:pPr>
     <w:rPr>
       <w:b w:val="1"/>
+      <w:bCs w:val="1"/>
     </w:rPr>
   </w:style>
   <w:style w:type="paragraph" w:styleId="Heading2">
@@ -3301,6 +3383,7 @@
     </w:pPr>
     <w:rPr>
       <w:b w:val="1"/>
+      <w:bCs w:val="1"/>
     </w:rPr>
   </w:style>
   <w:style w:type="paragraph" w:styleId="Heading3">
@@ -3326,6 +3409,7 @@
     </w:pPr>
     <w:rPr>
       <w:b w:val="1"/>
+      <w:bCs w:val="1"/>
     </w:rPr>
   </w:style>
   <w:style w:type="paragraph" w:styleId="Heading5">
@@ -3339,6 +3423,7 @@
     </w:pPr>
     <w:rPr>
       <w:b w:val="1"/>
+      <w:bCs w:val="1"/>
       <w:sz w:val="22"/>
       <w:szCs w:val="22"/>
     </w:rPr>
@@ -3354,6 +3439,7 @@
     </w:pPr>
     <w:rPr>
       <w:b w:val="1"/>
+      <w:bCs w:val="1"/>
       <w:sz w:val="20"/>
       <w:szCs w:val="20"/>
     </w:rPr>
@@ -3368,344 +3454,51 @@
     </w:pPr>
     <w:rPr/>
   </w:style>
+  <w:style w:type="table" w:styleId="TableNormal" w:default="1">
+    <w:name w:val="TableNormal"/>
+    <w:tblPr>
+      <w:tblCellMar>
+        <w:top w:w="100.0" w:type="dxa"/>
+        <w:left w:w="100.0" w:type="dxa"/>
+        <w:bottom w:w="100.0" w:type="dxa"/>
+        <w:right w:w="100.0" w:type="dxa"/>
+      </w:tblCellMar>
+    </w:tblPr>
+  </w:style>
   <w:style w:type="paragraph" w:styleId="Normal" w:default="1">
     <w:name w:val="normal"/>
   </w:style>
   <w:style w:type="table" w:styleId="TableNormal" w:default="1">
-    <w:name w:val="Table Normal"/>
-  </w:style>
-  <w:style w:type="paragraph" w:styleId="Heading1">
-    <w:name w:val="heading 1"/>
-    <w:basedOn w:val="Normal"/>
-    <w:next w:val="Normal"/>
-    <w:pPr>
-      <w:keepNext w:val="1"/>
-      <w:keepLines w:val="1"/>
-      <w:spacing w:after="0" w:before="240" w:lineRule="auto"/>
-      <w:ind w:left="2160" w:hanging="360"/>
-    </w:pPr>
-    <w:rPr>
-      <w:b w:val="1"/>
-    </w:rPr>
-  </w:style>
-  <w:style w:type="paragraph" w:styleId="Heading2">
-    <w:name w:val="heading 2"/>
-    <w:basedOn w:val="Normal"/>
-    <w:next w:val="Normal"/>
-    <w:pPr>
-      <w:keepNext w:val="1"/>
-      <w:keepLines w:val="1"/>
-      <w:spacing w:after="240" w:before="240" w:line="480" w:lineRule="auto"/>
-      <w:ind w:left="578" w:hanging="578"/>
-    </w:pPr>
-    <w:rPr>
-      <w:b w:val="1"/>
-    </w:rPr>
-  </w:style>
-  <w:style w:type="paragraph" w:styleId="Heading3">
-    <w:name w:val="heading 3"/>
-    <w:basedOn w:val="Normal"/>
-    <w:next w:val="Normal"/>
-    <w:pPr>
-      <w:keepNext w:val="1"/>
-      <w:keepLines w:val="1"/>
-      <w:spacing w:after="0" w:before="40" w:lineRule="auto"/>
-      <w:ind w:left="720" w:hanging="180"/>
-    </w:pPr>
-    <w:rPr/>
-  </w:style>
-  <w:style w:type="paragraph" w:styleId="Heading4">
-    <w:name w:val="heading 4"/>
-    <w:basedOn w:val="Normal"/>
-    <w:next w:val="Normal"/>
-    <w:pPr>
-      <w:keepNext w:val="1"/>
-      <w:keepLines w:val="1"/>
-      <w:spacing w:after="40" w:before="240" w:lineRule="auto"/>
-    </w:pPr>
-    <w:rPr>
-      <w:b w:val="1"/>
-    </w:rPr>
-  </w:style>
-  <w:style w:type="paragraph" w:styleId="Heading5">
-    <w:name w:val="heading 5"/>
-    <w:basedOn w:val="Normal"/>
-    <w:next w:val="Normal"/>
-    <w:pPr>
-      <w:keepNext w:val="1"/>
-      <w:keepLines w:val="1"/>
-      <w:spacing w:after="40" w:before="220" w:lineRule="auto"/>
-    </w:pPr>
-    <w:rPr>
-      <w:b w:val="1"/>
-      <w:sz w:val="22"/>
-      <w:szCs w:val="22"/>
-    </w:rPr>
-  </w:style>
-  <w:style w:type="paragraph" w:styleId="Heading6">
-    <w:name w:val="heading 6"/>
-    <w:basedOn w:val="Normal"/>
-    <w:next w:val="Normal"/>
-    <w:pPr>
-      <w:keepNext w:val="1"/>
-      <w:keepLines w:val="1"/>
-      <w:spacing w:after="40" w:before="200" w:lineRule="auto"/>
-    </w:pPr>
-    <w:rPr>
-      <w:b w:val="1"/>
-      <w:sz w:val="20"/>
-      <w:szCs w:val="20"/>
-    </w:rPr>
-  </w:style>
-  <w:style w:type="paragraph" w:styleId="Title">
-    <w:name w:val="Title"/>
-    <w:basedOn w:val="Normal"/>
-    <w:next w:val="Normal"/>
-    <w:pPr>
-      <w:spacing w:after="360" w:lineRule="auto"/>
-      <w:jc w:val="center"/>
-    </w:pPr>
-    <w:rPr/>
+    <w:name w:val="TableNormal"/>
+    <w:tblPr>
+      <w:tblCellMar>
+        <w:top w:w="100.0" w:type="dxa"/>
+        <w:left w:w="100.0" w:type="dxa"/>
+        <w:bottom w:w="100.0" w:type="dxa"/>
+        <w:right w:w="100.0" w:type="dxa"/>
+      </w:tblCellMar>
+    </w:tblPr>
   </w:style>
   <w:style w:type="paragraph" w:styleId="Normal" w:default="1">
     <w:name w:val="normal"/>
   </w:style>
+  <w:style w:type="paragraph" w:styleId="Normal" w:default="1">
+    <w:name w:val="normal"/>
+  </w:style>
   <w:style w:type="table" w:styleId="TableNormal" w:default="1">
     <w:name w:val="Table Normal"/>
   </w:style>
-  <w:style w:type="paragraph" w:styleId="Heading1">
-    <w:name w:val="heading 1"/>
-    <w:basedOn w:val="Normal"/>
-    <w:next w:val="Normal"/>
-    <w:pPr>
-      <w:keepNext w:val="1"/>
-      <w:keepLines w:val="1"/>
-      <w:spacing w:after="0" w:before="240" w:lineRule="auto"/>
-      <w:ind w:left="720" w:hanging="720"/>
-    </w:pPr>
-    <w:rPr>
-      <w:b w:val="1"/>
-    </w:rPr>
-  </w:style>
-  <w:style w:type="paragraph" w:styleId="Heading2">
-    <w:name w:val="heading 2"/>
-    <w:basedOn w:val="Normal"/>
-    <w:next w:val="Normal"/>
-    <w:pPr>
-      <w:keepNext w:val="1"/>
-      <w:keepLines w:val="1"/>
-      <w:spacing w:after="240" w:before="240" w:line="480" w:lineRule="auto"/>
-      <w:ind w:left="578" w:hanging="578"/>
-    </w:pPr>
-    <w:rPr>
-      <w:b w:val="1"/>
-    </w:rPr>
-  </w:style>
-  <w:style w:type="paragraph" w:styleId="Heading3">
-    <w:name w:val="heading 3"/>
-    <w:basedOn w:val="Normal"/>
-    <w:next w:val="Normal"/>
-    <w:pPr>
-      <w:keepNext w:val="1"/>
-      <w:keepLines w:val="1"/>
-      <w:spacing w:after="0" w:before="40" w:lineRule="auto"/>
-      <w:ind w:left="720" w:hanging="720"/>
-    </w:pPr>
-    <w:rPr/>
-  </w:style>
-  <w:style w:type="paragraph" w:styleId="Heading4">
-    <w:name w:val="heading 4"/>
-    <w:basedOn w:val="Normal"/>
-    <w:next w:val="Normal"/>
-    <w:pPr>
-      <w:keepNext w:val="1"/>
-      <w:keepLines w:val="1"/>
-      <w:spacing w:after="40" w:before="240" w:lineRule="auto"/>
-    </w:pPr>
-    <w:rPr>
-      <w:b w:val="1"/>
-    </w:rPr>
-  </w:style>
-  <w:style w:type="paragraph" w:styleId="Heading5">
-    <w:name w:val="heading 5"/>
-    <w:basedOn w:val="Normal"/>
-    <w:next w:val="Normal"/>
-    <w:pPr>
-      <w:keepNext w:val="1"/>
-      <w:keepLines w:val="1"/>
-      <w:spacing w:after="40" w:before="220" w:lineRule="auto"/>
-    </w:pPr>
-    <w:rPr>
-      <w:b w:val="1"/>
-      <w:sz w:val="22"/>
-      <w:szCs w:val="22"/>
-    </w:rPr>
-  </w:style>
-  <w:style w:type="paragraph" w:styleId="Heading6">
-    <w:name w:val="heading 6"/>
-    <w:basedOn w:val="Normal"/>
-    <w:next w:val="Normal"/>
-    <w:pPr>
-      <w:keepNext w:val="1"/>
-      <w:keepLines w:val="1"/>
-      <w:spacing w:after="40" w:before="200" w:lineRule="auto"/>
-    </w:pPr>
-    <w:rPr>
-      <w:b w:val="1"/>
-      <w:sz w:val="20"/>
-      <w:szCs w:val="20"/>
-    </w:rPr>
-  </w:style>
-  <w:style w:type="paragraph" w:styleId="Title">
-    <w:name w:val="Title"/>
-    <w:basedOn w:val="Normal"/>
-    <w:next w:val="Normal"/>
-    <w:pPr>
-      <w:spacing w:after="360" w:lineRule="auto"/>
-      <w:jc w:val="center"/>
-    </w:pPr>
-    <w:rPr/>
-  </w:style>
   <w:style w:type="paragraph" w:styleId="Normal" w:default="1">
-    <w:name w:val="Normal"/>
-    <w:qFormat w:val="1"/>
-    <w:rsid w:val="006B246A"/>
-  </w:style>
-  <w:style w:type="paragraph" w:styleId="Heading1">
-    <w:name w:val="heading 1"/>
-    <w:basedOn w:val="Normal"/>
-    <w:next w:val="Normal"/>
-    <w:link w:val="Heading1Char"/>
-    <w:uiPriority w:val="9"/>
-    <w:qFormat w:val="1"/>
-    <w:rsid w:val="006B246A"/>
-    <w:pPr>
-      <w:keepNext w:val="1"/>
-      <w:keepLines w:val="1"/>
-      <w:numPr>
-        <w:numId w:val="4"/>
-      </w:numPr>
-      <w:spacing w:after="0" w:before="240"/>
-      <w:outlineLvl w:val="0"/>
-    </w:pPr>
-    <w:rPr>
-      <w:rFonts w:cstheme="majorBidi" w:eastAsiaTheme="majorEastAsia"/>
-      <w:b w:val="1"/>
-      <w:szCs w:val="32"/>
-      <w:lang w:val="en-ID"/>
-    </w:rPr>
-  </w:style>
-  <w:style w:type="paragraph" w:styleId="Heading2">
-    <w:name w:val="heading 2"/>
-    <w:basedOn w:val="Normal"/>
-    <w:next w:val="Normal"/>
-    <w:link w:val="Heading2Char"/>
-    <w:uiPriority w:val="9"/>
-    <w:semiHidden w:val="1"/>
-    <w:unhideWhenUsed w:val="1"/>
-    <w:qFormat w:val="1"/>
-    <w:rsid w:val="00BB1B3F"/>
-    <w:pPr>
-      <w:keepNext w:val="1"/>
-      <w:keepLines w:val="1"/>
-      <w:numPr>
-        <w:ilvl w:val="1"/>
-        <w:numId w:val="5"/>
-      </w:numPr>
-      <w:spacing w:after="240" w:before="240" w:line="480" w:lineRule="auto"/>
-      <w:ind w:left="578" w:hanging="578"/>
-      <w:outlineLvl w:val="1"/>
-    </w:pPr>
-    <w:rPr>
-      <w:rFonts w:cstheme="majorBidi" w:eastAsiaTheme="majorEastAsia"/>
-      <w:b w:val="1"/>
-      <w:szCs w:val="26"/>
-      <w:lang w:val="en-ID"/>
-    </w:rPr>
-  </w:style>
-  <w:style w:type="paragraph" w:styleId="Heading3">
-    <w:name w:val="heading 3"/>
-    <w:basedOn w:val="Normal"/>
-    <w:next w:val="Normal"/>
-    <w:link w:val="Heading3Char"/>
-    <w:uiPriority w:val="9"/>
-    <w:semiHidden w:val="1"/>
-    <w:unhideWhenUsed w:val="1"/>
-    <w:qFormat w:val="1"/>
-    <w:rsid w:val="0049711A"/>
-    <w:pPr>
-      <w:keepNext w:val="1"/>
-      <w:keepLines w:val="1"/>
-      <w:numPr>
-        <w:ilvl w:val="2"/>
-        <w:numId w:val="6"/>
-      </w:numPr>
-      <w:spacing w:after="0" w:before="40"/>
-      <w:ind w:left="720"/>
-      <w:outlineLvl w:val="2"/>
-    </w:pPr>
-    <w:rPr>
-      <w:rFonts w:cstheme="majorBidi" w:eastAsiaTheme="majorEastAsia"/>
-      <w:lang w:val="en-ID"/>
-    </w:rPr>
-  </w:style>
-  <w:style w:type="paragraph" w:styleId="Heading4">
-    <w:name w:val="heading 4"/>
-    <w:basedOn w:val="Normal"/>
-    <w:next w:val="Normal"/>
-    <w:uiPriority w:val="9"/>
-    <w:semiHidden w:val="1"/>
-    <w:unhideWhenUsed w:val="1"/>
-    <w:qFormat w:val="1"/>
-    <w:pPr>
-      <w:keepNext w:val="1"/>
-      <w:keepLines w:val="1"/>
-      <w:spacing w:after="40" w:before="240"/>
-      <w:outlineLvl w:val="3"/>
-    </w:pPr>
-    <w:rPr>
-      <w:b w:val="1"/>
-    </w:rPr>
-  </w:style>
-  <w:style w:type="paragraph" w:styleId="Heading5">
-    <w:name w:val="heading 5"/>
-    <w:basedOn w:val="Normal"/>
-    <w:next w:val="Normal"/>
-    <w:uiPriority w:val="9"/>
-    <w:semiHidden w:val="1"/>
-    <w:unhideWhenUsed w:val="1"/>
-    <w:qFormat w:val="1"/>
-    <w:pPr>
-      <w:keepNext w:val="1"/>
-      <w:keepLines w:val="1"/>
-      <w:spacing w:after="40" w:before="220"/>
-      <w:outlineLvl w:val="4"/>
-    </w:pPr>
-    <w:rPr>
-      <w:b w:val="1"/>
-      <w:sz w:val="22"/>
-      <w:szCs w:val="22"/>
-    </w:rPr>
-  </w:style>
-  <w:style w:type="paragraph" w:styleId="Heading6">
-    <w:name w:val="heading 6"/>
-    <w:basedOn w:val="Normal"/>
-    <w:next w:val="Normal"/>
-    <w:uiPriority w:val="9"/>
-    <w:semiHidden w:val="1"/>
-    <w:unhideWhenUsed w:val="1"/>
-    <w:qFormat w:val="1"/>
-    <w:pPr>
-      <w:keepNext w:val="1"/>
-      <w:keepLines w:val="1"/>
-      <w:spacing w:after="40" w:before="200"/>
-      <w:outlineLvl w:val="5"/>
-    </w:pPr>
-    <w:rPr>
-      <w:b w:val="1"/>
-      <w:sz w:val="20"/>
-      <w:szCs w:val="20"/>
-    </w:rPr>
+    <w:name w:val="normal"/>
+  </w:style>
+  <w:style w:type="table" w:styleId="TableNormal" w:default="1">
+    <w:name w:val="Table Normal"/>
+  </w:style>
+  <w:style w:type="paragraph" w:styleId="Normal" w:default="1">
+    <w:name w:val="normal"/>
+  </w:style>
+  <w:style w:type="table" w:styleId="TableNormal" w:default="1">
+    <w:name w:val="Table Normal"/>
   </w:style>
   <w:style w:type="character" w:styleId="DefaultParagraphFont" w:default="1">
     <w:name w:val="Default Paragraph Font"/>
@@ -3734,27 +3527,6 @@
     <w:semiHidden w:val="1"/>
     <w:unhideWhenUsed w:val="1"/>
   </w:style>
-  <w:style w:type="paragraph" w:styleId="Title">
-    <w:name w:val="Title"/>
-    <w:basedOn w:val="Normal"/>
-    <w:next w:val="Normal"/>
-    <w:link w:val="TitleChar"/>
-    <w:uiPriority w:val="10"/>
-    <w:qFormat w:val="1"/>
-    <w:rsid w:val="0049711A"/>
-    <w:pPr>
-      <w:spacing w:after="360"/>
-      <w:contextualSpacing w:val="1"/>
-      <w:jc w:val="center"/>
-    </w:pPr>
-    <w:rPr>
-      <w:rFonts w:cstheme="majorBidi" w:eastAsiaTheme="majorEastAsia"/>
-      <w:spacing w:val="-10"/>
-      <w:kern w:val="28"/>
-      <w:szCs w:val="56"/>
-      <w:lang w:val="en-ID"/>
-    </w:rPr>
-  </w:style>
   <w:style w:type="character" w:styleId="Heading1Char" w:customStyle="1">
     <w:name w:val="Heading 1 Char"/>
     <w:basedOn w:val="DefaultParagraphFont"/>
@@ -3805,21 +3577,6 @@
       <w:rFonts w:ascii="Times New Roman" w:hAnsi="Times New Roman" w:cstheme="majorBidi" w:eastAsiaTheme="majorEastAsia"/>
       <w:sz w:val="24"/>
       <w:szCs w:val="24"/>
-    </w:rPr>
-  </w:style>
-  <w:style w:type="paragraph" w:styleId="Subtitle">
-    <w:name w:val="Subtitle"/>
-    <w:basedOn w:val="Normal"/>
-    <w:next w:val="Normal"/>
-    <w:link w:val="SubtitleChar"/>
-    <w:uiPriority w:val="11"/>
-    <w:qFormat w:val="1"/>
-    <w:pPr>
-      <w:spacing w:line="480" w:lineRule="auto"/>
-      <w:ind w:left="714" w:hanging="357"/>
-    </w:pPr>
-    <w:rPr>
-      <w:b w:val="1"/>
     </w:rPr>
   </w:style>
   <w:style w:type="character" w:styleId="SubtitleChar" w:customStyle="1">
@@ -3958,30 +3715,6 @@
     <w:uiPriority w:val="99"/>
     <w:rsid w:val="00151217"/>
   </w:style>
-  <w:style w:type="paragraph" w:styleId="Subtitle">
-    <w:name w:val="Subtitle"/>
-    <w:basedOn w:val="Normal"/>
-    <w:next w:val="Normal"/>
-    <w:pPr>
-      <w:spacing w:line="480" w:lineRule="auto"/>
-      <w:ind w:left="714" w:hanging="357"/>
-    </w:pPr>
-    <w:rPr>
-      <w:b w:val="1"/>
-    </w:rPr>
-  </w:style>
-  <w:style w:type="paragraph" w:styleId="Subtitle">
-    <w:name w:val="Subtitle"/>
-    <w:basedOn w:val="Normal"/>
-    <w:next w:val="Normal"/>
-    <w:pPr>
-      <w:spacing w:line="480" w:lineRule="auto"/>
-      <w:ind w:left="714" w:hanging="357"/>
-    </w:pPr>
-    <w:rPr>
-      <w:b w:val="1"/>
-    </w:rPr>
-  </w:style>
   <w:style w:type="table" w:styleId="Table1">
     <w:basedOn w:val="TableNormal"/>
     <w:pPr>
@@ -4014,6 +3747,102 @@
       </w:tblCellMar>
     </w:tblPr>
   </w:style>
+  <w:style w:type="table" w:styleId="Table1">
+    <w:basedOn w:val="TableNormal"/>
+    <w:pPr>
+      <w:spacing w:after="0" w:line="240" w:lineRule="auto"/>
+    </w:pPr>
+    <w:tblPr>
+      <w:tblStyleRowBandSize w:val="1"/>
+      <w:tblStyleColBandSize w:val="1"/>
+      <w:tblCellMar>
+        <w:top w:w="0.0" w:type="dxa"/>
+        <w:left w:w="108.0" w:type="dxa"/>
+        <w:bottom w:w="0.0" w:type="dxa"/>
+        <w:right w:w="108.0" w:type="dxa"/>
+      </w:tblCellMar>
+    </w:tblPr>
+  </w:style>
+  <w:style w:type="table" w:styleId="Table2">
+    <w:basedOn w:val="TableNormal"/>
+    <w:pPr>
+      <w:spacing w:after="0" w:line="240" w:lineRule="auto"/>
+    </w:pPr>
+    <w:tblPr>
+      <w:tblStyleRowBandSize w:val="1"/>
+      <w:tblStyleColBandSize w:val="1"/>
+      <w:tblCellMar>
+        <w:top w:w="0.0" w:type="dxa"/>
+        <w:left w:w="108.0" w:type="dxa"/>
+        <w:bottom w:w="0.0" w:type="dxa"/>
+        <w:right w:w="108.0" w:type="dxa"/>
+      </w:tblCellMar>
+    </w:tblPr>
+  </w:style>
+  <w:style w:type="table" w:styleId="Table1">
+    <w:basedOn w:val="TableNormal"/>
+    <w:pPr>
+      <w:spacing w:after="0" w:line="240" w:lineRule="auto"/>
+    </w:pPr>
+    <w:tblPr>
+      <w:tblStyleRowBandSize w:val="1"/>
+      <w:tblStyleColBandSize w:val="1"/>
+      <w:tblCellMar>
+        <w:top w:w="0.0" w:type="dxa"/>
+        <w:left w:w="108.0" w:type="dxa"/>
+        <w:bottom w:w="0.0" w:type="dxa"/>
+        <w:right w:w="108.0" w:type="dxa"/>
+      </w:tblCellMar>
+    </w:tblPr>
+  </w:style>
+  <w:style w:type="table" w:styleId="Table2">
+    <w:basedOn w:val="TableNormal"/>
+    <w:pPr>
+      <w:spacing w:after="0" w:line="240" w:lineRule="auto"/>
+    </w:pPr>
+    <w:tblPr>
+      <w:tblStyleRowBandSize w:val="1"/>
+      <w:tblStyleColBandSize w:val="1"/>
+      <w:tblCellMar>
+        <w:top w:w="0.0" w:type="dxa"/>
+        <w:left w:w="108.0" w:type="dxa"/>
+        <w:bottom w:w="0.0" w:type="dxa"/>
+        <w:right w:w="108.0" w:type="dxa"/>
+      </w:tblCellMar>
+    </w:tblPr>
+  </w:style>
+  <w:style w:type="table" w:styleId="Table1">
+    <w:basedOn w:val="TableNormal"/>
+    <w:pPr>
+      <w:spacing w:after="0" w:line="240" w:lineRule="auto"/>
+    </w:pPr>
+    <w:tblPr>
+      <w:tblStyleRowBandSize w:val="1"/>
+      <w:tblStyleColBandSize w:val="1"/>
+      <w:tblCellMar>
+        <w:top w:w="0.0" w:type="dxa"/>
+        <w:left w:w="108.0" w:type="dxa"/>
+        <w:bottom w:w="0.0" w:type="dxa"/>
+        <w:right w:w="108.0" w:type="dxa"/>
+      </w:tblCellMar>
+    </w:tblPr>
+  </w:style>
+  <w:style w:type="table" w:styleId="Table2">
+    <w:basedOn w:val="TableNormal"/>
+    <w:pPr>
+      <w:spacing w:after="0" w:line="240" w:lineRule="auto"/>
+    </w:pPr>
+    <w:tblPr>
+      <w:tblStyleRowBandSize w:val="1"/>
+      <w:tblStyleColBandSize w:val="1"/>
+      <w:tblCellMar>
+        <w:top w:w="0.0" w:type="dxa"/>
+        <w:left w:w="108.0" w:type="dxa"/>
+        <w:bottom w:w="0.0" w:type="dxa"/>
+        <w:right w:w="108.0" w:type="dxa"/>
+      </w:tblCellMar>
+    </w:tblPr>
+  </w:style>
   <w:style w:type="paragraph" w:styleId="Subtitle">
     <w:name w:val="Subtitle"/>
     <w:basedOn w:val="Normal"/>
@@ -4024,6 +3853,7 @@
     </w:pPr>
     <w:rPr>
       <w:b w:val="1"/>
+      <w:bCs w:val="1"/>
     </w:rPr>
   </w:style>
   <w:style w:type="table" w:styleId="Table1">
@@ -4358,7 +4188,7 @@
 
 <file path=customXML/item1.xml><?xml version="1.0" encoding="utf-8"?>
 <go:gDocsCustomXmlDataStorage xmlns:go="http://customooxmlschemas.google.com/" xmlns:r="http://schemas.openxmlformats.org/officeDocument/2006/relationships" uri="GoogleDocsCustomDataVersion2">
-  <go:docsCustomData xmlns:go="http://customooxmlschemas.google.com/" roundtripDataSignature="AMtx7mh2z9vvaBI6eP+bHLwVtt8mvMnzAg==">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</go:docsCustomData>
+  <go:docsCustomData xmlns:go="http://customooxmlschemas.google.com/" roundtripDataSignature="AMtx7mi62UEo4pl/XU20VTVYCykA1c6yzQ==">CgMxLjAyCWguMzBqMHpsbDgAciExTXVCaG00LVQ3UmpONFgyMVUyZUlzU3kwMTkxZFJJNEI=</go:docsCustomData>
 </go:gDocsCustomXmlDataStorage>
 </file>
 

</xml_diff>